<commit_message>
Finalizing Axe Bearer (006) with GS script
</commit_message>
<xml_diff>
--- a/Phase2/card-files/AO_early-alpha_data/MountGrandsire_script.docx
+++ b/Phase2/card-files/AO_early-alpha_data/MountGrandsire_script.docx
@@ -90,6 +90,57 @@
           <w:szCs w:val="144"/>
         </w:rPr>
         <w:t>ꝛꜫ</w:t>
+      </w:r>
+    </w:p>
+    <w:p>
+      <w:pPr>
+        <w:rPr>
+          <w:rFonts w:ascii="Times New Roman" w:hAnsi="Times New Roman" w:cs="Times New Roman"/>
+          <w:sz w:val="144"/>
+          <w:szCs w:val="144"/>
+        </w:rPr>
+      </w:pPr>
+      <w:r>
+        <w:rPr>
+          <w:rFonts w:ascii="Times New Roman" w:hAnsi="Times New Roman" w:cs="Times New Roman"/>
+          <w:sz w:val="144"/>
+          <w:szCs w:val="144"/>
+        </w:rPr>
+        <w:t>Ꞛ</w:t>
+      </w:r>
+      <w:r>
+        <w:rPr>
+          <w:rFonts w:ascii="Cambria Math" w:hAnsi="Cambria Math" w:cs="Cambria Math"/>
+          <w:sz w:val="144"/>
+          <w:szCs w:val="144"/>
+        </w:rPr>
+        <w:t>𝔵</w:t>
+      </w:r>
+      <w:r>
+        <w:rPr>
+          <w:rFonts w:ascii="Cambria Math" w:hAnsi="Cambria Math" w:cs="Cambria Math"/>
+          <w:sz w:val="144"/>
+          <w:szCs w:val="144"/>
+        </w:rPr>
+        <w:t xml:space="preserve"> /</w:t>
+      </w:r>
+      <w:proofErr w:type="spellStart"/>
+      <w:r>
+        <w:rPr>
+          <w:rFonts w:ascii="Cambria Math" w:hAnsi="Cambria Math" w:cs="Cambria Math"/>
+          <w:sz w:val="144"/>
+          <w:szCs w:val="144"/>
+        </w:rPr>
+        <w:t>Aex</w:t>
+      </w:r>
+      <w:proofErr w:type="spellEnd"/>
+      <w:r>
+        <w:rPr>
+          <w:rFonts w:ascii="Cambria Math" w:hAnsi="Cambria Math" w:cs="Cambria Math"/>
+          <w:sz w:val="144"/>
+          <w:szCs w:val="144"/>
+        </w:rPr>
+        <w:t xml:space="preserve"> = Axe</w:t>
       </w:r>
     </w:p>
     <w:p>

</xml_diff>

<commit_message>
Minor format change to docx, adding print table
</commit_message>
<xml_diff>
--- a/Phase2/card-files/AO_early-alpha_data/MountGrandsire_script.docx
+++ b/Phase2/card-files/AO_early-alpha_data/MountGrandsire_script.docx
@@ -122,7 +122,7 @@
           <w:sz w:val="144"/>
           <w:szCs w:val="144"/>
         </w:rPr>
-        <w:t xml:space="preserve"> /</w:t>
+        <w:t>/</w:t>
       </w:r>
       <w:proofErr w:type="spellStart"/>
       <w:r>
@@ -140,7 +140,7 @@
           <w:sz w:val="144"/>
           <w:szCs w:val="144"/>
         </w:rPr>
-        <w:t xml:space="preserve"> = Axe</w:t>
+        <w:t>=Axe</w:t>
       </w:r>
     </w:p>
     <w:p>
@@ -866,6 +866,7 @@
   <w:style w:type="character" w:default="1" w:styleId="DefaultParagraphFont">
     <w:name w:val="Default Paragraph Font"/>
     <w:uiPriority w:val="1"/>
+    <w:semiHidden/>
     <w:unhideWhenUsed/>
   </w:style>
   <w:style w:type="table" w:default="1" w:styleId="TableNormal">

</xml_diff>